<commit_message>
Complete Assignment 7 agent testing and revision
</commit_message>
<xml_diff>
--- a/agents/organizational_adoption_agent/records/Assignment_7_Organizational_Adoption_Agent_Record.docx
+++ b/agents/organizational_adoption_agent/records/Assignment_7_Organizational_Adoption_Agent_Record.docx
@@ -110,7 +110,7 @@
         <w:spacing w:after="140"/>
       </w:pPr>
       <w:r>
-        <w:t>Readiness is stage-dependent. An organization may be ready for a limited, reversible pilot but not ready for scale. For the proposed customer-support application, potentially consequential inquiries need appropriate human escalation or oversight, and performance should be measured against a relevant existing support baseline. The actual management recommendation must follow the completed case response rather than be assumed in advance.</w:t>
+        <w:t>Readiness is stage-dependent. The final startup run recommends readiness-building before a pilot because the baseline, escalation design, accountable owner, governance process, and capacity to operate controls are not established. The final established-SaaS run recommends a conditional low-consequence pilot because governance and ongoing ownership are stated, while scale remains unsupported. Both runs require human escalation for consequential inquiries and measurement against a relevant existing support baseline.</w:t>
       </w:r>
     </w:p>
     <w:p>
@@ -135,7 +135,15 @@
         <w:spacing w:after="140"/>
       </w:pPr>
       <w:r>
-        <w:t>Two complete common-intake cases and their prompt packets are prepared. No structured ChatGPT responses or validator outputs were present when this record was prepared; therefore, no test result, revision result, or validation pass is claimed. The remaining manual workflow is documented in testing_and_revision_plan.md.</w:t>
+        <w:t>The prepared packets were executed through the available LLM capability. The initial primary and contrast responses both recommended a conditional pilot. This exposed a context-sensitivity weakness because the startup's missing stage gates did not change the action category. The specialist was revised to require a baseline, named owner, bounded scope, escalation/control design, and observation capacity before a pilot. The rerun recommends readiness-building for the startup and a conditional low-consequence pilot for the established organization.</w:t>
+      </w:r>
+    </w:p>
+    <w:p>
+      <w:pPr>
+        <w:spacing w:after="140"/>
+      </w:pPr>
+      <w:r>
+        <w:t>Initial and final responses are saved in the responses directory. All four response files passed the frozen local response validator. The stable conclusion is that maturity remains unclassified without independent evidence and that escalation/baseline evidence is necessary. The changed conclusion is the organization-specific next step.</w:t>
       </w:r>
     </w:p>
     <w:p>
@@ -151,7 +159,7 @@
         <w:spacing w:after="140"/>
       </w:pPr>
       <w:r>
-        <w:t>AI and verification note: Codex assisted with the specialist structure, case inputs, prompt packets, and this record. The unavailable assigned textbook source was not replaced with model memory. No external factual claim, structured model response, or validation result is represented as completed unless saved in the repository.</w:t>
+        <w:t>AI and verification note: Codex generated the saved structured responses from the packet contexts, revised the specialist after inspecting the initial contrast weakness, and ran the local validator. The unavailable assigned textbook source was not replaced with model memory. Case facts are explicitly labeled assumptions; no external factual citation is represented as verified.</w:t>
       </w:r>
     </w:p>
     <w:p>

</xml_diff>

<commit_message>
Finalize Assignment 7 audit and reflection
</commit_message>
<xml_diff>
--- a/agents/organizational_adoption_agent/records/Assignment_7_Organizational_Adoption_Agent_Record.docx
+++ b/agents/organizational_adoption_agent/records/Assignment_7_Organizational_Adoption_Agent_Record.docx
@@ -1002,7 +1002,7 @@
               <w:rPr>
                 <w:sz w:val="18"/>
               </w:rPr>
-              <w:t>Chapter 8 treats LLM-based generative AI as leading edge for most business applications, while warning that maturity is application- and organization-specific. The saved runs do not claim an independently verified maturity classification beyond the provided course framework.</w:t>
+              <w:t>Chapter 8 treats LLM-based generative AI as leading edge for most business applications, while warning that maturity is application- and organization-specific. The saved runs use that course framework and do not claim provider-specific performance evidence.</w:t>
             </w:r>
           </w:p>
         </w:tc>
@@ -1653,7 +1653,7 @@
               <w:rPr>
                 <w:sz w:val="18"/>
               </w:rPr>
-              <w:t>Case facts are assumptions. Request current support metrics, ticket classification, escalation-test evidence, named owner/capacity, provider/data terms, controls, and approval criteria. No ECTM formula or score was invented.</w:t>
+              <w:t>Case facts are assumptions. Request current support metrics, ticket classification, escalation-test evidence, named owner/capacity, provider/data terms, controls, and approval criteria. Chapter 9 ECTM is reserved for a scale-use-case decision, with evidence-based ratings rather than invented scores.</w:t>
             </w:r>
           </w:p>
         </w:tc>
@@ -1872,7 +1872,7 @@
               <w:rPr>
                 <w:sz w:val="18"/>
               </w:rPr>
-              <w:t>Codex structured the agent, generated and saved packet-context responses, identified the initial contrast weakness, revised the stage gate, and ran the local validator and Frozen Core check. The textbook is now available; no provider-specific or external factual claim was presented as verified without source evidence.</w:t>
+              <w:t>Codex structured the agent, generated and saved packet-context responses, identified the initial contrast weakness, revised the stage gate, and ran the local validator and Frozen Core check. Chapters 8-9 informed the maturity/readiness and ECTM instructions. No provider-specific claim was presented as verified without source evidence.</w:t>
             </w:r>
           </w:p>
         </w:tc>

</xml_diff>